<commit_message>
Rename framework: Entropic Discrete Emergence Model -> Entropy Driven Expansion Model
Acronym EDEM is unchanged; updates the expanded name in the README title and
citation, and inside both companion papers (Paper A body + reference, Paper B
abstract). Repository name retained (EDEM still applies).

Co-Authored-By: Claude Opus 4.7 (1M context) <noreply@anthropic.com>
</commit_message>
<xml_diff>
--- a/papers/EDEM_Paper_A_Note_v2.docx
+++ b/papers/EDEM_Paper_A_Note_v2.docx
@@ -108,7 +108,7 @@
           <w:sz w:val="22"/>
           <w:szCs w:val="22"/>
         </w:rPr>
-        <w:t xml:space="preserve">This note's mathematical content is elementary; it is intended primarily as arithmetic background for a physics framework rather than as a standalone number-theoretic result. The mathematics used throughout is elementary: properties of the sixth cyclotomic polynomial, multiplicative orders modulo a prime, and congruence arithmetic. We collect these standard ingredients into a specific structure — the intersection of the σ-lattice and the Φ₆-tower — because that structure is the basis for particle selection in the Entropic Discrete Emergence Model (EDEM, companion paper [1]).</w:t>
+        <w:t xml:space="preserve">This note's mathematical content is elementary; it is intended primarily as arithmetic background for a physics framework rather than as a standalone number-theoretic result. The mathematics used throughout is elementary: properties of the sixth cyclotomic polynomial, multiplicative orders modulo a prime, and congruence arithmetic. We collect these standard ingredients into a specific structure — the intersection of the σ-lattice and the Φ₆-tower — because that structure is the basis for particle selection in the Entropy Driven Expansion Model (EDEM, companion paper [1]).</w:t>
       </w:r>
     </w:p>
     <w:p>
@@ -1011,7 +1011,7 @@
           <w:sz w:val="22"/>
           <w:szCs w:val="22"/>
         </w:rPr>
-        <w:t xml:space="preserve">[1] Watson, J. Entropic Discrete Emergence Model (EDEM): Particle Sector. Companion paper, 2026.</w:t>
+        <w:t xml:space="preserve">[1] Watson, J. Entropy Driven Expansion Model (EDEM): Particle Sector. Companion paper, 2026.</w:t>
       </w:r>
     </w:p>
     <w:p>

</xml_diff>